<commit_message>
feat: integrate evidence-to-alpha research loop
</commit_message>
<xml_diff>
--- a/deliverables/01_开源选型与MVP建议.docx
+++ b/deliverables/01_开源选型与MVP建议.docx
@@ -26,7 +26,7 @@
           <w:color w:val="464A50"/>
           <w:sz w:val="26"/>
         </w:rPr>
-        <w:t>Evidence-to-Alpha Trading System</w:t>
+        <w:t>三系统交易研究闭环</w:t>
       </w:r>
     </w:p>
     <w:p>
@@ -70,7 +70,7 @@
           <w:color w:val="23262B"/>
           <w:sz w:val="21"/>
         </w:rPr>
-        <w:t>v0.1.0 MVP</w:t>
+        <w:t>v0.2.0 Integration MVP</w:t>
       </w:r>
     </w:p>
     <w:p>
@@ -114,7 +114,7 @@
           <w:color w:val="23262B"/>
           <w:sz w:val="21"/>
         </w:rPr>
-        <w:t>选型结论已冻结；外部上线仍需授权</w:t>
+        <w:t>选型已冻结；研究/Paper 可用；Live 阻断</w:t>
       </w:r>
     </w:p>
     <w:p>
@@ -130,7 +130,23 @@
         <w:pStyle w:val="Heading1"/>
       </w:pPr>
       <w:r>
-        <w:t>执行摘要</w:t>
+        <w:t>执行结论</w:t>
+      </w:r>
+    </w:p>
+    <w:p>
+      <w:r>
+        <w:rPr>
+          <w:rFonts w:ascii="Calibri" w:hAnsi="Calibri" w:eastAsia="Microsoft YaHei"/>
+          <w:b/>
+        </w:rPr>
+        <w:t>建议：</w:t>
+      </w:r>
+      <w:r>
+        <w:rPr>
+          <w:rFonts w:ascii="Calibri" w:hAnsi="Calibri" w:eastAsia="Microsoft YaHei"/>
+          <w:i w:val="0"/>
+        </w:rPr>
+        <w:t>基于现有两个项目增加薄集成层。不要直接引入第三套完整交易引擎，也不要重写多因子平台。</w:t>
       </w:r>
     </w:p>
     <w:p>
@@ -139,7 +155,7 @@
           <w:rFonts w:ascii="Calibri" w:hAnsi="Calibri" w:eastAsia="Microsoft YaHei"/>
           <w:i w:val="0"/>
         </w:rPr>
-        <w:t>结论：自己开发一个薄集成项目，不直接使用或 fork 完整交易引擎。核心差异是 point-in-time 证据链、事件版本不可覆盖、事件与因子信号叠加、逐笔 Paper OMS 追溯和研究门禁；这些约束无法从单一通用交易引擎直接获得。</w:t>
+        <w:t>新项目把新闻证据转换为 point-in-time 事件 Alpha，并在 multi-factor-alpha-platform 的 V4 组合控制之前注入有限幅度权重调整。因子平台继续拥有因子、V4 风控、T+1 回测与归因；新闻系统继续拥有采集、事件、证据和影响分析。</w:t>
       </w:r>
     </w:p>
     <w:p>
@@ -148,7 +164,7 @@
           <w:rFonts w:ascii="Calibri" w:hAnsi="Calibri" w:eastAsia="Microsoft YaHei"/>
           <w:i w:val="0"/>
         </w:rPr>
-        <w:t>建议复用成熟项目的局部能力或接口思想：Qlib 的研究记录、Zipline Reloaded 的交易日历和事件循环、NautilusTrader/LEAN 的订单模型设计。vectorbt 具备研究速度优势，但当前仓库含 Commons Clause，不作为基础依赖。</w:t>
+        <w:t>闭环：新闻证据 -&gt; 事件版本 -&gt; 事件 Alpha -&gt; 因子 + 事件预 V4 权重 -&gt; V4 风控 -&gt; T+1 回测/Paper OMS -&gt; 归因反馈。</w:t>
       </w:r>
     </w:p>
     <w:p>
@@ -156,7 +172,7 @@
         <w:pStyle w:val="Heading1"/>
       </w:pPr>
       <w:r>
-        <w:t>候选项目对比</w:t>
+        <w:t>三项目职责</w:t>
       </w:r>
     </w:p>
     <w:tbl>
@@ -168,17 +184,19 @@
         <w:tblInd w:w="120" w:type="dxa"/>
       </w:tblPr>
       <w:tblGrid>
-        <w:gridCol w:w="1450"/>
-        <w:gridCol w:w="2200"/>
-        <w:gridCol w:w="1650"/>
-        <w:gridCol w:w="2600"/>
-        <w:gridCol w:w="1460"/>
+        <w:gridCol w:w="2450"/>
+        <w:gridCol w:w="3800"/>
+        <w:gridCol w:w="3110"/>
       </w:tblGrid>
       <w:tr>
+        <w:trPr>
+          <w:cantSplit/>
+          <w:tblHeader w:val="true"/>
+        </w:trPr>
         <w:tc>
           <w:tcPr>
-            <w:tcW w:type="dxa" w:w="1450"/>
-            <w:shd w:fill="E8EEF5"/>
+            <w:tcW w:type="dxa" w:w="2450"/>
+            <w:shd w:fill="F2F4F7"/>
             <w:tcMar>
               <w:top w:w="80" w:type="dxa"/>
               <w:start w:w="120" w:type="dxa"/>
@@ -204,8 +222,8 @@
         </w:tc>
         <w:tc>
           <w:tcPr>
-            <w:tcW w:type="dxa" w:w="2200"/>
-            <w:shd w:fill="E8EEF5"/>
+            <w:tcW w:type="dxa" w:w="3800"/>
+            <w:shd w:fill="F2F4F7"/>
             <w:tcMar>
               <w:top w:w="80" w:type="dxa"/>
               <w:start w:w="120" w:type="dxa"/>
@@ -225,14 +243,14 @@
                 <w:color w:val="1F4D78"/>
                 <w:sz w:val="20"/>
               </w:rPr>
-              <w:t>维护/许可证</w:t>
+              <w:t>保留职责</w:t>
             </w:r>
           </w:p>
         </w:tc>
         <w:tc>
           <w:tcPr>
-            <w:tcW w:type="dxa" w:w="1650"/>
-            <w:shd w:fill="E8EEF5"/>
+            <w:tcW w:type="dxa" w:w="3110"/>
+            <w:shd w:fill="F2F4F7"/>
             <w:tcMar>
               <w:top w:w="80" w:type="dxa"/>
               <w:start w:w="120" w:type="dxa"/>
@@ -252,14 +270,250 @@
                 <w:color w:val="1F4D78"/>
                 <w:sz w:val="20"/>
               </w:rPr>
-              <w:t>部署复杂度</w:t>
+              <w:t>集成边界</w:t>
+            </w:r>
+          </w:p>
+        </w:tc>
+      </w:tr>
+      <w:tr>
+        <w:trPr>
+          <w:cantSplit/>
+        </w:trPr>
+        <w:tc>
+          <w:tcPr>
+            <w:tcW w:type="dxa" w:w="2450"/>
+            <w:tcMar>
+              <w:top w:w="80" w:type="dxa"/>
+              <w:start w:w="120" w:type="dxa"/>
+              <w:bottom w:w="80" w:type="dxa"/>
+              <w:end w:w="120" w:type="dxa"/>
+            </w:tcMar>
+            <w:vAlign w:val="center"/>
+          </w:tcPr>
+          <w:p>
+            <w:r>
+              <w:rPr>
+                <w:rFonts w:ascii="Calibri" w:hAnsi="Calibri" w:eastAsia="Microsoft YaHei"/>
+                <w:sz w:val="19"/>
+              </w:rPr>
+              <w:t>News Claws / 127.0.0.1:8765</w:t>
             </w:r>
           </w:p>
         </w:tc>
         <w:tc>
           <w:tcPr>
-            <w:tcW w:type="dxa" w:w="2600"/>
-            <w:shd w:fill="E8EEF5"/>
+            <w:tcW w:type="dxa" w:w="3800"/>
+            <w:tcMar>
+              <w:top w:w="80" w:type="dxa"/>
+              <w:start w:w="120" w:type="dxa"/>
+              <w:bottom w:w="80" w:type="dxa"/>
+              <w:end w:w="120" w:type="dxa"/>
+            </w:tcMar>
+            <w:vAlign w:val="center"/>
+          </w:tcPr>
+          <w:p>
+            <w:r>
+              <w:rPr>
+                <w:rFonts w:ascii="Calibri" w:hAnsi="Calibri" w:eastAsia="Microsoft YaHei"/>
+                <w:sz w:val="19"/>
+              </w:rPr>
+              <w:t>新闻采集、事件聚类、来源证据、可信度、公司/行业影响、时间线</w:t>
+            </w:r>
+          </w:p>
+        </w:tc>
+        <w:tc>
+          <w:tcPr>
+            <w:tcW w:type="dxa" w:w="3110"/>
+            <w:tcMar>
+              <w:top w:w="80" w:type="dxa"/>
+              <w:start w:w="120" w:type="dxa"/>
+              <w:bottom w:w="80" w:type="dxa"/>
+              <w:end w:w="120" w:type="dxa"/>
+            </w:tcMar>
+            <w:vAlign w:val="center"/>
+          </w:tcPr>
+          <w:p>
+            <w:r>
+              <w:rPr>
+                <w:rFonts w:ascii="Calibri" w:hAnsi="Calibri" w:eastAsia="Microsoft YaHei"/>
+                <w:sz w:val="19"/>
+              </w:rPr>
+              <w:t>只读 GET；逐版本导出，不读内部 SQLite</w:t>
+            </w:r>
+          </w:p>
+        </w:tc>
+      </w:tr>
+      <w:tr>
+        <w:trPr>
+          <w:cantSplit/>
+        </w:trPr>
+        <w:tc>
+          <w:tcPr>
+            <w:tcW w:type="dxa" w:w="2450"/>
+            <w:tcMar>
+              <w:top w:w="80" w:type="dxa"/>
+              <w:start w:w="120" w:type="dxa"/>
+              <w:bottom w:w="80" w:type="dxa"/>
+              <w:end w:w="120" w:type="dxa"/>
+            </w:tcMar>
+            <w:vAlign w:val="center"/>
+          </w:tcPr>
+          <w:p>
+            <w:r>
+              <w:rPr>
+                <w:rFonts w:ascii="Calibri" w:hAnsi="Calibri" w:eastAsia="Microsoft YaHei"/>
+                <w:sz w:val="19"/>
+              </w:rPr>
+              <w:t>Evidence-to-Alpha</w:t>
+            </w:r>
+          </w:p>
+        </w:tc>
+        <w:tc>
+          <w:tcPr>
+            <w:tcW w:type="dxa" w:w="3800"/>
+            <w:tcMar>
+              <w:top w:w="80" w:type="dxa"/>
+              <w:start w:w="120" w:type="dxa"/>
+              <w:bottom w:w="80" w:type="dxa"/>
+              <w:end w:w="120" w:type="dxa"/>
+            </w:tcMar>
+            <w:vAlign w:val="center"/>
+          </w:tcPr>
+          <w:p>
+            <w:r>
+              <w:rPr>
+                <w:rFonts w:ascii="Calibri" w:hAnsi="Calibri" w:eastAsia="Microsoft YaHei"/>
+                <w:sz w:val="19"/>
+              </w:rPr>
+              <w:t>时间契约、事件信号、三路融合、追溯、Paper OMS、研究门禁</w:t>
+            </w:r>
+          </w:p>
+        </w:tc>
+        <w:tc>
+          <w:tcPr>
+            <w:tcW w:type="dxa" w:w="3110"/>
+            <w:tcMar>
+              <w:top w:w="80" w:type="dxa"/>
+              <w:start w:w="120" w:type="dxa"/>
+              <w:bottom w:w="80" w:type="dxa"/>
+              <w:end w:w="120" w:type="dxa"/>
+            </w:tcMar>
+            <w:vAlign w:val="center"/>
+          </w:tcPr>
+          <w:p>
+            <w:r>
+              <w:rPr>
+                <w:rFonts w:ascii="Calibri" w:hAnsi="Calibri" w:eastAsia="Microsoft YaHei"/>
+                <w:sz w:val="19"/>
+              </w:rPr>
+              <w:t>编排层；不复制新闻前端和因子库</w:t>
+            </w:r>
+          </w:p>
+        </w:tc>
+      </w:tr>
+      <w:tr>
+        <w:trPr>
+          <w:cantSplit/>
+        </w:trPr>
+        <w:tc>
+          <w:tcPr>
+            <w:tcW w:type="dxa" w:w="2450"/>
+            <w:tcMar>
+              <w:top w:w="80" w:type="dxa"/>
+              <w:start w:w="120" w:type="dxa"/>
+              <w:bottom w:w="80" w:type="dxa"/>
+              <w:end w:w="120" w:type="dxa"/>
+            </w:tcMar>
+            <w:vAlign w:val="center"/>
+          </w:tcPr>
+          <w:p>
+            <w:r>
+              <w:rPr>
+                <w:rFonts w:ascii="Calibri" w:hAnsi="Calibri" w:eastAsia="Microsoft YaHei"/>
+                <w:sz w:val="19"/>
+              </w:rPr>
+              <w:t>multi-factor-alpha-platform</w:t>
+            </w:r>
+          </w:p>
+        </w:tc>
+        <w:tc>
+          <w:tcPr>
+            <w:tcW w:type="dxa" w:w="3800"/>
+            <w:tcMar>
+              <w:top w:w="80" w:type="dxa"/>
+              <w:start w:w="120" w:type="dxa"/>
+              <w:bottom w:w="80" w:type="dxa"/>
+              <w:end w:w="120" w:type="dxa"/>
+            </w:tcMar>
+            <w:vAlign w:val="center"/>
+          </w:tcPr>
+          <w:p>
+            <w:r>
+              <w:rPr>
+                <w:rFonts w:ascii="Calibri" w:hAnsi="Calibri" w:eastAsia="Microsoft YaHei"/>
+                <w:sz w:val="19"/>
+              </w:rPr>
+              <w:t>V3 权重、V4 风控、T+1 回测、风险归因、发布门禁</w:t>
+            </w:r>
+          </w:p>
+        </w:tc>
+        <w:tc>
+          <w:tcPr>
+            <w:tcW w:type="dxa" w:w="3110"/>
+            <w:tcMar>
+              <w:top w:w="80" w:type="dxa"/>
+              <w:start w:w="120" w:type="dxa"/>
+              <w:bottom w:w="80" w:type="dxa"/>
+              <w:end w:w="120" w:type="dxa"/>
+            </w:tcMar>
+            <w:vAlign w:val="center"/>
+          </w:tcPr>
+          <w:p>
+            <w:r>
+              <w:rPr>
+                <w:rFonts w:ascii="Calibri" w:hAnsi="Calibri" w:eastAsia="Microsoft YaHei"/>
+                <w:sz w:val="19"/>
+              </w:rPr>
+              <w:t>CSV/Parquet 文件契约；可选子进程验证</w:t>
+            </w:r>
+          </w:p>
+        </w:tc>
+      </w:tr>
+    </w:tbl>
+    <w:p>
+      <w:pPr>
+        <w:spacing w:after="40"/>
+      </w:pPr>
+    </w:p>
+    <w:p>
+      <w:pPr>
+        <w:pStyle w:val="Heading1"/>
+      </w:pPr>
+      <w:r>
+        <w:t>现有多因子项目评估</w:t>
+      </w:r>
+    </w:p>
+    <w:tbl>
+      <w:tblPr>
+        <w:tblStyle w:val="TableGrid"/>
+        <w:tblW w:type="dxa" w:w="9360"/>
+        <w:tblLayout w:type="fixed"/>
+        <w:tblLook w:firstColumn="1" w:firstRow="1" w:lastColumn="0" w:lastRow="0" w:noHBand="0" w:noVBand="1" w:val="04A0"/>
+        <w:tblInd w:w="120" w:type="dxa"/>
+      </w:tblPr>
+      <w:tblGrid>
+        <w:gridCol w:w="2100"/>
+        <w:gridCol w:w="7260"/>
+      </w:tblGrid>
+      <w:tr>
+        <w:trPr>
+          <w:cantSplit/>
+          <w:tblHeader w:val="true"/>
+        </w:trPr>
+        <w:tc>
+          <w:tcPr>
+            <w:tcW w:type="dxa" w:w="2100"/>
+            <w:shd w:fill="F2F4F7"/>
             <w:tcMar>
               <w:top w:w="80" w:type="dxa"/>
               <w:start w:w="120" w:type="dxa"/>
@@ -279,14 +533,527 @@
                 <w:color w:val="1F4D78"/>
                 <w:sz w:val="20"/>
               </w:rPr>
-              <w:t>可复用能力</w:t>
+              <w:t>维度</w:t>
             </w:r>
           </w:p>
         </w:tc>
         <w:tc>
           <w:tcPr>
-            <w:tcW w:type="dxa" w:w="1460"/>
-            <w:shd w:fill="E8EEF5"/>
+            <w:tcW w:type="dxa" w:w="7260"/>
+            <w:shd w:fill="F2F4F7"/>
+            <w:tcMar>
+              <w:top w:w="80" w:type="dxa"/>
+              <w:start w:w="120" w:type="dxa"/>
+              <w:bottom w:w="80" w:type="dxa"/>
+              <w:end w:w="120" w:type="dxa"/>
+            </w:tcMar>
+            <w:vAlign w:val="center"/>
+          </w:tcPr>
+          <w:p>
+            <w:pPr>
+              <w:jc w:val="left"/>
+            </w:pPr>
+            <w:r>
+              <w:rPr>
+                <w:rFonts w:ascii="Calibri" w:hAnsi="Calibri" w:eastAsia="Microsoft YaHei"/>
+                <w:b/>
+                <w:color w:val="1F4D78"/>
+                <w:sz w:val="20"/>
+              </w:rPr>
+              <w:t>直接验证结果</w:t>
+            </w:r>
+          </w:p>
+        </w:tc>
+      </w:tr>
+      <w:tr>
+        <w:trPr>
+          <w:cantSplit/>
+        </w:trPr>
+        <w:tc>
+          <w:tcPr>
+            <w:tcW w:type="dxa" w:w="2100"/>
+            <w:tcMar>
+              <w:top w:w="80" w:type="dxa"/>
+              <w:start w:w="120" w:type="dxa"/>
+              <w:bottom w:w="80" w:type="dxa"/>
+              <w:end w:w="120" w:type="dxa"/>
+            </w:tcMar>
+            <w:vAlign w:val="center"/>
+          </w:tcPr>
+          <w:p>
+            <w:r>
+              <w:rPr>
+                <w:rFonts w:ascii="Calibri" w:hAnsi="Calibri" w:eastAsia="Microsoft YaHei"/>
+                <w:sz w:val="19"/>
+              </w:rPr>
+              <w:t>维护</w:t>
+            </w:r>
+          </w:p>
+        </w:tc>
+        <w:tc>
+          <w:tcPr>
+            <w:tcW w:type="dxa" w:w="7260"/>
+            <w:tcMar>
+              <w:top w:w="80" w:type="dxa"/>
+              <w:start w:w="120" w:type="dxa"/>
+              <w:bottom w:w="80" w:type="dxa"/>
+              <w:end w:w="120" w:type="dxa"/>
+            </w:tcMar>
+            <w:vAlign w:val="center"/>
+          </w:tcPr>
+          <w:p>
+            <w:r>
+              <w:rPr>
+                <w:rFonts w:ascii="Calibri" w:hAnsi="Calibri" w:eastAsia="Microsoft YaHei"/>
+                <w:sz w:val="19"/>
+              </w:rPr>
+              <w:t>提交 9792ed27059b1179b39cca8fca2982fe22baf86e；2026-06-21 23:50:03 +08:00</w:t>
+            </w:r>
+          </w:p>
+        </w:tc>
+      </w:tr>
+      <w:tr>
+        <w:trPr>
+          <w:cantSplit/>
+        </w:trPr>
+        <w:tc>
+          <w:tcPr>
+            <w:tcW w:type="dxa" w:w="2100"/>
+            <w:tcMar>
+              <w:top w:w="80" w:type="dxa"/>
+              <w:start w:w="120" w:type="dxa"/>
+              <w:bottom w:w="80" w:type="dxa"/>
+              <w:end w:w="120" w:type="dxa"/>
+            </w:tcMar>
+            <w:vAlign w:val="center"/>
+          </w:tcPr>
+          <w:p>
+            <w:r>
+              <w:rPr>
+                <w:rFonts w:ascii="Calibri" w:hAnsi="Calibri" w:eastAsia="Microsoft YaHei"/>
+                <w:sz w:val="19"/>
+              </w:rPr>
+              <w:t>许可证</w:t>
+            </w:r>
+          </w:p>
+        </w:tc>
+        <w:tc>
+          <w:tcPr>
+            <w:tcW w:type="dxa" w:w="7260"/>
+            <w:tcMar>
+              <w:top w:w="80" w:type="dxa"/>
+              <w:start w:w="120" w:type="dxa"/>
+              <w:bottom w:w="80" w:type="dxa"/>
+              <w:end w:w="120" w:type="dxa"/>
+            </w:tcMar>
+            <w:vAlign w:val="center"/>
+          </w:tcPr>
+          <w:p>
+            <w:r>
+              <w:rPr>
+                <w:rFonts w:ascii="Calibri" w:hAnsi="Calibri" w:eastAsia="Microsoft YaHei"/>
+                <w:sz w:val="19"/>
+              </w:rPr>
+              <w:t>MIT</w:t>
+            </w:r>
+          </w:p>
+        </w:tc>
+      </w:tr>
+      <w:tr>
+        <w:trPr>
+          <w:cantSplit/>
+        </w:trPr>
+        <w:tc>
+          <w:tcPr>
+            <w:tcW w:type="dxa" w:w="2100"/>
+            <w:tcMar>
+              <w:top w:w="80" w:type="dxa"/>
+              <w:start w:w="120" w:type="dxa"/>
+              <w:bottom w:w="80" w:type="dxa"/>
+              <w:end w:w="120" w:type="dxa"/>
+            </w:tcMar>
+            <w:vAlign w:val="center"/>
+          </w:tcPr>
+          <w:p>
+            <w:r>
+              <w:rPr>
+                <w:rFonts w:ascii="Calibri" w:hAnsi="Calibri" w:eastAsia="Microsoft YaHei"/>
+                <w:sz w:val="19"/>
+              </w:rPr>
+              <w:t>可复用</w:t>
+            </w:r>
+          </w:p>
+        </w:tc>
+        <w:tc>
+          <w:tcPr>
+            <w:tcW w:type="dxa" w:w="7260"/>
+            <w:tcMar>
+              <w:top w:w="80" w:type="dxa"/>
+              <w:start w:w="120" w:type="dxa"/>
+              <w:bottom w:w="80" w:type="dxa"/>
+              <w:end w:w="120" w:type="dxa"/>
+            </w:tcMar>
+            <w:vAlign w:val="center"/>
+          </w:tcPr>
+          <w:p>
+            <w:r>
+              <w:rPr>
+                <w:rFonts w:ascii="Calibri" w:hAnsi="Calibri" w:eastAsia="Microsoft YaHei"/>
+                <w:sz w:val="19"/>
+              </w:rPr>
+              <w:t>run_backtest.py、run_v4_pipeline.py、V3 权重契约、V4 风控、归因和发布门禁</w:t>
+            </w:r>
+          </w:p>
+        </w:tc>
+      </w:tr>
+      <w:tr>
+        <w:trPr>
+          <w:cantSplit/>
+        </w:trPr>
+        <w:tc>
+          <w:tcPr>
+            <w:tcW w:type="dxa" w:w="2100"/>
+            <w:tcMar>
+              <w:top w:w="80" w:type="dxa"/>
+              <w:start w:w="120" w:type="dxa"/>
+              <w:bottom w:w="80" w:type="dxa"/>
+              <w:end w:w="120" w:type="dxa"/>
+            </w:tcMar>
+            <w:vAlign w:val="center"/>
+          </w:tcPr>
+          <w:p>
+            <w:r>
+              <w:rPr>
+                <w:rFonts w:ascii="Calibri" w:hAnsi="Calibri" w:eastAsia="Microsoft YaHei"/>
+                <w:sz w:val="19"/>
+              </w:rPr>
+              <w:t>部署</w:t>
+            </w:r>
+          </w:p>
+        </w:tc>
+        <w:tc>
+          <w:tcPr>
+            <w:tcW w:type="dxa" w:w="7260"/>
+            <w:tcMar>
+              <w:top w:w="80" w:type="dxa"/>
+              <w:start w:w="120" w:type="dxa"/>
+              <w:bottom w:w="80" w:type="dxa"/>
+              <w:end w:w="120" w:type="dxa"/>
+            </w:tcMar>
+            <w:vAlign w:val="center"/>
+          </w:tcPr>
+          <w:p>
+            <w:r>
+              <w:rPr>
+                <w:rFonts w:ascii="Calibri" w:hAnsi="Calibri" w:eastAsia="Microsoft YaHei"/>
+                <w:sz w:val="19"/>
+              </w:rPr>
+              <w:t>中等：Python、pandas、pyarrow、cvxpy；大型权重和价格文件需在本地恢复</w:t>
+            </w:r>
+          </w:p>
+        </w:tc>
+      </w:tr>
+      <w:tr>
+        <w:trPr>
+          <w:cantSplit/>
+        </w:trPr>
+        <w:tc>
+          <w:tcPr>
+            <w:tcW w:type="dxa" w:w="2100"/>
+            <w:tcMar>
+              <w:top w:w="80" w:type="dxa"/>
+              <w:start w:w="120" w:type="dxa"/>
+              <w:bottom w:w="80" w:type="dxa"/>
+              <w:end w:w="120" w:type="dxa"/>
+            </w:tcMar>
+            <w:vAlign w:val="center"/>
+          </w:tcPr>
+          <w:p>
+            <w:r>
+              <w:rPr>
+                <w:rFonts w:ascii="Calibri" w:hAnsi="Calibri" w:eastAsia="Microsoft YaHei"/>
+                <w:sz w:val="19"/>
+              </w:rPr>
+              <w:t>公共仓库缺口</w:t>
+            </w:r>
+          </w:p>
+        </w:tc>
+        <w:tc>
+          <w:tcPr>
+            <w:tcW w:type="dxa" w:w="7260"/>
+            <w:tcMar>
+              <w:top w:w="80" w:type="dxa"/>
+              <w:start w:w="120" w:type="dxa"/>
+              <w:bottom w:w="80" w:type="dxa"/>
+              <w:end w:w="120" w:type="dxa"/>
+            </w:tcMar>
+            <w:vAlign w:val="center"/>
+          </w:tcPr>
+          <w:p>
+            <w:r>
+              <w:rPr>
+                <w:rFonts w:ascii="Calibri" w:hAnsi="Calibri" w:eastAsia="Microsoft YaHei"/>
+                <w:sz w:val="19"/>
+              </w:rPr>
+              <w:t>v3_weights.parquet 与 data/processed/prices.parquet 未提交；sector map 可见</w:t>
+            </w:r>
+          </w:p>
+        </w:tc>
+      </w:tr>
+      <w:tr>
+        <w:trPr>
+          <w:cantSplit/>
+        </w:trPr>
+        <w:tc>
+          <w:tcPr>
+            <w:tcW w:type="dxa" w:w="2100"/>
+            <w:tcMar>
+              <w:top w:w="80" w:type="dxa"/>
+              <w:start w:w="120" w:type="dxa"/>
+              <w:bottom w:w="80" w:type="dxa"/>
+              <w:end w:w="120" w:type="dxa"/>
+            </w:tcMar>
+            <w:vAlign w:val="center"/>
+          </w:tcPr>
+          <w:p>
+            <w:r>
+              <w:rPr>
+                <w:rFonts w:ascii="Calibri" w:hAnsi="Calibri" w:eastAsia="Microsoft YaHei"/>
+                <w:sz w:val="19"/>
+              </w:rPr>
+              <w:t>Live 状态</w:t>
+            </w:r>
+          </w:p>
+        </w:tc>
+        <w:tc>
+          <w:tcPr>
+            <w:tcW w:type="dxa" w:w="7260"/>
+            <w:tcMar>
+              <w:top w:w="80" w:type="dxa"/>
+              <w:start w:w="120" w:type="dxa"/>
+              <w:bottom w:w="80" w:type="dxa"/>
+              <w:end w:w="120" w:type="dxa"/>
+            </w:tcMar>
+            <w:vAlign w:val="center"/>
+          </w:tcPr>
+          <w:p>
+            <w:r>
+              <w:rPr>
+                <w:rFonts w:ascii="Calibri" w:hAnsi="Calibri" w:eastAsia="Microsoft YaHei"/>
+                <w:sz w:val="19"/>
+              </w:rPr>
+              <w:t>BLOCKED：真实 PB borrow feed 和 dry-run manifest 未满足</w:t>
+            </w:r>
+          </w:p>
+        </w:tc>
+      </w:tr>
+    </w:tbl>
+    <w:p>
+      <w:pPr>
+        <w:spacing w:after="40"/>
+      </w:pPr>
+    </w:p>
+    <w:p>
+      <w:r>
+        <w:rPr>
+          <w:rFonts w:ascii="Calibri" w:hAnsi="Calibri" w:eastAsia="Microsoft YaHei"/>
+          <w:i w:val="0"/>
+        </w:rPr>
+        <w:t>本轮生成的预 V4 cache 被该仓库 production loader 接受，清单为 input_mode=prod、validation_state=PASS、cvxpy 路径通过；同时 borrow_feed_present=false。</w:t>
+      </w:r>
+    </w:p>
+    <w:p>
+      <w:pPr>
+        <w:pStyle w:val="Heading1"/>
+      </w:pPr>
+      <w:r>
+        <w:t>新闻系统评估</w:t>
+      </w:r>
+    </w:p>
+    <w:p>
+      <w:pPr>
+        <w:pStyle w:val="ListBullet"/>
+      </w:pPr>
+      <w:r>
+        <w:rPr>
+          <w:rFonts w:ascii="Calibri" w:hAnsi="Calibri" w:eastAsia="Microsoft YaHei"/>
+        </w:rPr>
+        <w:t>只读端点已跑通：事件列表、逐版本详情、时间线、统计和来源列表。</w:t>
+      </w:r>
+    </w:p>
+    <w:p>
+      <w:pPr>
+        <w:pStyle w:val="ListBullet"/>
+      </w:pPr>
+      <w:r>
+        <w:rPr>
+          <w:rFonts w:ascii="Calibri" w:hAnsi="Calibri" w:eastAsia="Microsoft YaHei"/>
+        </w:rPr>
+        <w:t>逐版本详情包含 claim/evidence、source URL、NVDA/TSM ticker、行业影响、可靠性、新颖性和不确定性。</w:t>
+      </w:r>
+    </w:p>
+    <w:p>
+      <w:pPr>
+        <w:pStyle w:val="ListBullet"/>
+      </w:pPr>
+      <w:r>
+        <w:rPr>
+          <w:rFonts w:ascii="Calibri" w:hAnsi="Calibri" w:eastAsia="Microsoft YaHei"/>
+        </w:rPr>
+        <w:t>当前数据为 1 个 synthetic event、2 个版本；默认禁止进入研究，只有显式 opt-in 才能运行。</w:t>
+      </w:r>
+    </w:p>
+    <w:p>
+      <w:pPr>
+        <w:pStyle w:val="ListBullet"/>
+      </w:pPr>
+      <w:r>
+        <w:rPr>
+          <w:rFonts w:ascii="Calibri" w:hAnsi="Calibri" w:eastAsia="Microsoft YaHei"/>
+        </w:rPr>
+        <w:t>discovered_at/created_at 早于 published_at 时采用最大时间作为 observed_at，宁可延后，不提前可见性。</w:t>
+      </w:r>
+    </w:p>
+    <w:p>
+      <w:pPr>
+        <w:pStyle w:val="Heading1"/>
+      </w:pPr>
+      <w:r>
+        <w:t>开源候选对比</w:t>
+      </w:r>
+    </w:p>
+    <w:tbl>
+      <w:tblPr>
+        <w:tblStyle w:val="TableGrid"/>
+        <w:tblW w:type="dxa" w:w="9360"/>
+        <w:tblLayout w:type="fixed"/>
+        <w:tblLook w:firstColumn="1" w:firstRow="1" w:lastColumn="0" w:lastRow="0" w:noHBand="0" w:noVBand="1" w:val="04A0"/>
+        <w:tblInd w:w="120" w:type="dxa"/>
+      </w:tblPr>
+      <w:tblGrid>
+        <w:gridCol w:w="1760"/>
+        <w:gridCol w:w="1750"/>
+        <w:gridCol w:w="900"/>
+        <w:gridCol w:w="3070"/>
+        <w:gridCol w:w="1880"/>
+      </w:tblGrid>
+      <w:tr>
+        <w:trPr>
+          <w:cantSplit/>
+          <w:tblHeader w:val="true"/>
+        </w:trPr>
+        <w:tc>
+          <w:tcPr>
+            <w:tcW w:type="dxa" w:w="1760"/>
+            <w:shd w:fill="F2F4F7"/>
+            <w:tcMar>
+              <w:top w:w="80" w:type="dxa"/>
+              <w:start w:w="120" w:type="dxa"/>
+              <w:bottom w:w="80" w:type="dxa"/>
+              <w:end w:w="120" w:type="dxa"/>
+            </w:tcMar>
+            <w:vAlign w:val="center"/>
+          </w:tcPr>
+          <w:p>
+            <w:pPr>
+              <w:jc w:val="left"/>
+            </w:pPr>
+            <w:r>
+              <w:rPr>
+                <w:rFonts w:ascii="Calibri" w:hAnsi="Calibri" w:eastAsia="Microsoft YaHei"/>
+                <w:b/>
+                <w:color w:val="1F4D78"/>
+                <w:sz w:val="20"/>
+              </w:rPr>
+              <w:t>项目</w:t>
+            </w:r>
+          </w:p>
+        </w:tc>
+        <w:tc>
+          <w:tcPr>
+            <w:tcW w:type="dxa" w:w="1750"/>
+            <w:shd w:fill="F2F4F7"/>
+            <w:tcMar>
+              <w:top w:w="80" w:type="dxa"/>
+              <w:start w:w="120" w:type="dxa"/>
+              <w:bottom w:w="80" w:type="dxa"/>
+              <w:end w:w="120" w:type="dxa"/>
+            </w:tcMar>
+            <w:vAlign w:val="center"/>
+          </w:tcPr>
+          <w:p>
+            <w:pPr>
+              <w:jc w:val="left"/>
+            </w:pPr>
+            <w:r>
+              <w:rPr>
+                <w:rFonts w:ascii="Calibri" w:hAnsi="Calibri" w:eastAsia="Microsoft YaHei"/>
+                <w:b/>
+                <w:color w:val="1F4D78"/>
+                <w:sz w:val="20"/>
+              </w:rPr>
+              <w:t>维护/许可</w:t>
+            </w:r>
+          </w:p>
+        </w:tc>
+        <w:tc>
+          <w:tcPr>
+            <w:tcW w:type="dxa" w:w="900"/>
+            <w:shd w:fill="F2F4F7"/>
+            <w:tcMar>
+              <w:top w:w="80" w:type="dxa"/>
+              <w:start w:w="120" w:type="dxa"/>
+              <w:bottom w:w="80" w:type="dxa"/>
+              <w:end w:w="120" w:type="dxa"/>
+            </w:tcMar>
+            <w:vAlign w:val="center"/>
+          </w:tcPr>
+          <w:p>
+            <w:pPr>
+              <w:jc w:val="left"/>
+            </w:pPr>
+            <w:r>
+              <w:rPr>
+                <w:rFonts w:ascii="Calibri" w:hAnsi="Calibri" w:eastAsia="Microsoft YaHei"/>
+                <w:b/>
+                <w:color w:val="1F4D78"/>
+                <w:sz w:val="20"/>
+              </w:rPr>
+              <w:t>部署</w:t>
+            </w:r>
+          </w:p>
+        </w:tc>
+        <w:tc>
+          <w:tcPr>
+            <w:tcW w:type="dxa" w:w="3070"/>
+            <w:shd w:fill="F2F4F7"/>
+            <w:tcMar>
+              <w:top w:w="80" w:type="dxa"/>
+              <w:start w:w="120" w:type="dxa"/>
+              <w:bottom w:w="80" w:type="dxa"/>
+              <w:end w:w="120" w:type="dxa"/>
+            </w:tcMar>
+            <w:vAlign w:val="center"/>
+          </w:tcPr>
+          <w:p>
+            <w:pPr>
+              <w:jc w:val="left"/>
+            </w:pPr>
+            <w:r>
+              <w:rPr>
+                <w:rFonts w:ascii="Calibri" w:hAnsi="Calibri" w:eastAsia="Microsoft YaHei"/>
+                <w:b/>
+                <w:color w:val="1F4D78"/>
+                <w:sz w:val="20"/>
+              </w:rPr>
+              <w:t>可复用</w:t>
+            </w:r>
+          </w:p>
+        </w:tc>
+        <w:tc>
+          <w:tcPr>
+            <w:tcW w:type="dxa" w:w="1880"/>
+            <w:shd w:fill="F2F4F7"/>
             <w:tcMar>
               <w:top w:w="80" w:type="dxa"/>
               <w:start w:w="120" w:type="dxa"/>
@@ -310,14 +1077,14 @@
             </w:r>
           </w:p>
         </w:tc>
-        <w:trPr>
-          <w:tblHeader/>
-        </w:trPr>
       </w:tr>
       <w:tr>
+        <w:trPr>
+          <w:cantSplit/>
+        </w:trPr>
         <w:tc>
           <w:tcPr>
-            <w:tcW w:type="dxa" w:w="1450"/>
+            <w:tcW w:type="dxa" w:w="1760"/>
             <w:tcMar>
               <w:top w:w="80" w:type="dxa"/>
               <w:start w:w="120" w:type="dxa"/>
@@ -338,7 +1105,7 @@
         </w:tc>
         <w:tc>
           <w:tcPr>
-            <w:tcW w:type="dxa" w:w="2200"/>
+            <w:tcW w:type="dxa" w:w="1750"/>
             <w:tcMar>
               <w:top w:w="80" w:type="dxa"/>
               <w:start w:w="120" w:type="dxa"/>
@@ -353,13 +1120,13 @@
                 <w:rFonts w:ascii="Calibri" w:hAnsi="Calibri" w:eastAsia="Microsoft YaHei"/>
                 <w:sz w:val="19"/>
               </w:rPr>
-              <w:t>活跃；MIT；2026-07-23 推送；PyPI 0.9.7</w:t>
+              <w:t>活跃；MIT</w:t>
             </w:r>
           </w:p>
         </w:tc>
         <w:tc>
           <w:tcPr>
-            <w:tcW w:type="dxa" w:w="1650"/>
+            <w:tcW w:type="dxa" w:w="900"/>
             <w:tcMar>
               <w:top w:w="80" w:type="dxa"/>
               <w:start w:w="120" w:type="dxa"/>
@@ -374,13 +1141,13 @@
                 <w:rFonts w:ascii="Calibri" w:hAnsi="Calibri" w:eastAsia="Microsoft YaHei"/>
                 <w:sz w:val="19"/>
               </w:rPr>
-              <w:t>中高；依赖和数据准备较多</w:t>
+              <w:t>中高</w:t>
             </w:r>
           </w:p>
         </w:tc>
         <w:tc>
           <w:tcPr>
-            <w:tcW w:type="dxa" w:w="2600"/>
+            <w:tcW w:type="dxa" w:w="3070"/>
             <w:tcMar>
               <w:top w:w="80" w:type="dxa"/>
               <w:start w:w="120" w:type="dxa"/>
@@ -395,13 +1162,13 @@
                 <w:rFonts w:ascii="Calibri" w:hAnsi="Calibri" w:eastAsia="Microsoft YaHei"/>
                 <w:sz w:val="19"/>
               </w:rPr>
-              <w:t>数据集、工作流、记录器、组合分析</w:t>
+              <w:t>工作流、记录器、组合分析</w:t>
             </w:r>
           </w:p>
         </w:tc>
         <w:tc>
           <w:tcPr>
-            <w:tcW w:type="dxa" w:w="1460"/>
+            <w:tcW w:type="dxa" w:w="1880"/>
             <w:tcMar>
               <w:top w:w="80" w:type="dxa"/>
               <w:start w:w="120" w:type="dxa"/>
@@ -416,15 +1183,18 @@
                 <w:rFonts w:ascii="Calibri" w:hAnsi="Calibri" w:eastAsia="Microsoft YaHei"/>
                 <w:sz w:val="19"/>
               </w:rPr>
-              <w:t>参考，不 fork</w:t>
+              <w:t>参考，不做内核</w:t>
             </w:r>
           </w:p>
         </w:tc>
       </w:tr>
       <w:tr>
+        <w:trPr>
+          <w:cantSplit/>
+        </w:trPr>
         <w:tc>
           <w:tcPr>
-            <w:tcW w:type="dxa" w:w="1450"/>
+            <w:tcW w:type="dxa" w:w="1760"/>
             <w:tcMar>
               <w:top w:w="80" w:type="dxa"/>
               <w:start w:w="120" w:type="dxa"/>
@@ -445,7 +1215,7 @@
         </w:tc>
         <w:tc>
           <w:tcPr>
-            <w:tcW w:type="dxa" w:w="2200"/>
+            <w:tcW w:type="dxa" w:w="1750"/>
             <w:tcMar>
               <w:top w:w="80" w:type="dxa"/>
               <w:start w:w="120" w:type="dxa"/>
@@ -460,13 +1230,13 @@
                 <w:rFonts w:ascii="Calibri" w:hAnsi="Calibri" w:eastAsia="Microsoft YaHei"/>
                 <w:sz w:val="19"/>
               </w:rPr>
-              <w:t>活跃；Apache-2.0；2026-01-06 推送；PyPI 3.1.1</w:t>
+              <w:t>活跃；Apache-2.0</w:t>
             </w:r>
           </w:p>
         </w:tc>
         <w:tc>
           <w:tcPr>
-            <w:tcW w:type="dxa" w:w="1650"/>
+            <w:tcW w:type="dxa" w:w="900"/>
             <w:tcMar>
               <w:top w:w="80" w:type="dxa"/>
               <w:start w:w="120" w:type="dxa"/>
@@ -481,13 +1251,13 @@
                 <w:rFonts w:ascii="Calibri" w:hAnsi="Calibri" w:eastAsia="Microsoft YaHei"/>
                 <w:sz w:val="19"/>
               </w:rPr>
-              <w:t>中；pip/conda 可装，bundle 有门槛</w:t>
+              <w:t>中</w:t>
             </w:r>
           </w:p>
         </w:tc>
         <w:tc>
           <w:tcPr>
-            <w:tcW w:type="dxa" w:w="2600"/>
+            <w:tcW w:type="dxa" w:w="3070"/>
             <w:tcMar>
               <w:top w:w="80" w:type="dxa"/>
               <w:start w:w="120" w:type="dxa"/>
@@ -502,13 +1272,13 @@
                 <w:rFonts w:ascii="Calibri" w:hAnsi="Calibri" w:eastAsia="Microsoft YaHei"/>
                 <w:sz w:val="19"/>
               </w:rPr>
-              <w:t>交易日历、事件循环、绩效</w:t>
+              <w:t>日历、事件循环、绩效</w:t>
             </w:r>
           </w:p>
         </w:tc>
         <w:tc>
           <w:tcPr>
-            <w:tcW w:type="dxa" w:w="1460"/>
+            <w:tcW w:type="dxa" w:w="1880"/>
             <w:tcMar>
               <w:top w:w="80" w:type="dxa"/>
               <w:start w:w="120" w:type="dxa"/>
@@ -523,15 +1293,18 @@
                 <w:rFonts w:ascii="Calibri" w:hAnsi="Calibri" w:eastAsia="Microsoft YaHei"/>
                 <w:sz w:val="19"/>
               </w:rPr>
-              <w:t>后续可选适配器</w:t>
+              <w:t>后续适配器</w:t>
             </w:r>
           </w:p>
         </w:tc>
       </w:tr>
       <w:tr>
+        <w:trPr>
+          <w:cantSplit/>
+        </w:trPr>
         <w:tc>
           <w:tcPr>
-            <w:tcW w:type="dxa" w:w="1450"/>
+            <w:tcW w:type="dxa" w:w="1760"/>
             <w:tcMar>
               <w:top w:w="80" w:type="dxa"/>
               <w:start w:w="120" w:type="dxa"/>
@@ -552,7 +1325,7 @@
         </w:tc>
         <w:tc>
           <w:tcPr>
-            <w:tcW w:type="dxa" w:w="2200"/>
+            <w:tcW w:type="dxa" w:w="1750"/>
             <w:tcMar>
               <w:top w:w="80" w:type="dxa"/>
               <w:start w:w="120" w:type="dxa"/>
@@ -567,13 +1340,13 @@
                 <w:rFonts w:ascii="Calibri" w:hAnsi="Calibri" w:eastAsia="Microsoft YaHei"/>
                 <w:sz w:val="19"/>
               </w:rPr>
-              <w:t>高活跃；LGPL-3.0；2026-08-20 推送；PyPI 1.231.0</w:t>
+              <w:t>高活跃；LGPL-3.0</w:t>
             </w:r>
           </w:p>
         </w:tc>
         <w:tc>
           <w:tcPr>
-            <w:tcW w:type="dxa" w:w="1650"/>
+            <w:tcW w:type="dxa" w:w="900"/>
             <w:tcMar>
               <w:top w:w="80" w:type="dxa"/>
               <w:start w:w="120" w:type="dxa"/>
@@ -588,13 +1361,13 @@
                 <w:rFonts w:ascii="Calibri" w:hAnsi="Calibri" w:eastAsia="Microsoft YaHei"/>
                 <w:sz w:val="19"/>
               </w:rPr>
-              <w:t>高；Rust/Python 3.12+</w:t>
+              <w:t>高</w:t>
             </w:r>
           </w:p>
         </w:tc>
         <w:tc>
           <w:tcPr>
-            <w:tcW w:type="dxa" w:w="2600"/>
+            <w:tcW w:type="dxa" w:w="3070"/>
             <w:tcMar>
               <w:top w:w="80" w:type="dxa"/>
               <w:start w:w="120" w:type="dxa"/>
@@ -609,13 +1382,13 @@
                 <w:rFonts w:ascii="Calibri" w:hAnsi="Calibri" w:eastAsia="Microsoft YaHei"/>
                 <w:sz w:val="19"/>
               </w:rPr>
-              <w:t>确定性事件驱动、订单/成交/持仓</w:t>
+              <w:t>订单、成交、持仓</w:t>
             </w:r>
           </w:p>
         </w:tc>
         <w:tc>
           <w:tcPr>
-            <w:tcW w:type="dxa" w:w="1460"/>
+            <w:tcW w:type="dxa" w:w="1880"/>
             <w:tcMar>
               <w:top w:w="80" w:type="dxa"/>
               <w:start w:w="120" w:type="dxa"/>
@@ -636,9 +1409,12 @@
         </w:tc>
       </w:tr>
       <w:tr>
+        <w:trPr>
+          <w:cantSplit/>
+        </w:trPr>
         <w:tc>
           <w:tcPr>
-            <w:tcW w:type="dxa" w:w="1450"/>
+            <w:tcW w:type="dxa" w:w="1760"/>
             <w:tcMar>
               <w:top w:w="80" w:type="dxa"/>
               <w:start w:w="120" w:type="dxa"/>
@@ -659,7 +1435,7 @@
         </w:tc>
         <w:tc>
           <w:tcPr>
-            <w:tcW w:type="dxa" w:w="2200"/>
+            <w:tcW w:type="dxa" w:w="1750"/>
             <w:tcMar>
               <w:top w:w="80" w:type="dxa"/>
               <w:start w:w="120" w:type="dxa"/>
@@ -674,13 +1450,13 @@
                 <w:rFonts w:ascii="Calibri" w:hAnsi="Calibri" w:eastAsia="Microsoft YaHei"/>
                 <w:sz w:val="19"/>
               </w:rPr>
-              <w:t>高活跃；Apache-2.0；2026-08-19 推送；CLI 1.0.228</w:t>
+              <w:t>高活跃；Apache-2.0</w:t>
             </w:r>
           </w:p>
         </w:tc>
         <w:tc>
           <w:tcPr>
-            <w:tcW w:type="dxa" w:w="1650"/>
+            <w:tcW w:type="dxa" w:w="900"/>
             <w:tcMar>
               <w:top w:w="80" w:type="dxa"/>
               <w:start w:w="120" w:type="dxa"/>
@@ -695,13 +1471,13 @@
                 <w:rFonts w:ascii="Calibri" w:hAnsi="Calibri" w:eastAsia="Microsoft YaHei"/>
                 <w:sz w:val="19"/>
               </w:rPr>
-              <w:t>高；Docker/.NET/数据约定</w:t>
+              <w:t>高</w:t>
             </w:r>
           </w:p>
         </w:tc>
         <w:tc>
           <w:tcPr>
-            <w:tcW w:type="dxa" w:w="2600"/>
+            <w:tcW w:type="dxa" w:w="3070"/>
             <w:tcMar>
               <w:top w:w="80" w:type="dxa"/>
               <w:start w:w="120" w:type="dxa"/>
@@ -716,13 +1492,13 @@
                 <w:rFonts w:ascii="Calibri" w:hAnsi="Calibri" w:eastAsia="Microsoft YaHei"/>
                 <w:sz w:val="19"/>
               </w:rPr>
-              <w:t>多资产回测和 Paper/Live</w:t>
+              <w:t>多资产、Paper/Live、券商</w:t>
             </w:r>
           </w:p>
         </w:tc>
         <w:tc>
           <w:tcPr>
-            <w:tcW w:type="dxa" w:w="1460"/>
+            <w:tcW w:type="dxa" w:w="1880"/>
             <w:tcMar>
               <w:top w:w="80" w:type="dxa"/>
               <w:start w:w="120" w:type="dxa"/>
@@ -737,15 +1513,18 @@
                 <w:rFonts w:ascii="Calibri" w:hAnsi="Calibri" w:eastAsia="Microsoft YaHei"/>
                 <w:sz w:val="19"/>
               </w:rPr>
-              <w:t>功能过重</w:t>
+              <w:t>过重，不引入</w:t>
             </w:r>
           </w:p>
         </w:tc>
       </w:tr>
       <w:tr>
+        <w:trPr>
+          <w:cantSplit/>
+        </w:trPr>
         <w:tc>
           <w:tcPr>
-            <w:tcW w:type="dxa" w:w="1450"/>
+            <w:tcW w:type="dxa" w:w="1760"/>
             <w:tcMar>
               <w:top w:w="80" w:type="dxa"/>
               <w:start w:w="120" w:type="dxa"/>
@@ -766,7 +1545,7 @@
         </w:tc>
         <w:tc>
           <w:tcPr>
-            <w:tcW w:type="dxa" w:w="2200"/>
+            <w:tcW w:type="dxa" w:w="1750"/>
             <w:tcMar>
               <w:top w:w="80" w:type="dxa"/>
               <w:start w:w="120" w:type="dxa"/>
@@ -781,13 +1560,13 @@
                 <w:rFonts w:ascii="Calibri" w:hAnsi="Calibri" w:eastAsia="Microsoft YaHei"/>
                 <w:sz w:val="19"/>
               </w:rPr>
-              <w:t>活跃；2026-08-02 推送；Commons Clause</w:t>
+              <w:t>活跃；Commons Clause</w:t>
             </w:r>
           </w:p>
         </w:tc>
         <w:tc>
           <w:tcPr>
-            <w:tcW w:type="dxa" w:w="1650"/>
+            <w:tcW w:type="dxa" w:w="900"/>
             <w:tcMar>
               <w:top w:w="80" w:type="dxa"/>
               <w:start w:w="120" w:type="dxa"/>
@@ -802,13 +1581,13 @@
                 <w:rFonts w:ascii="Calibri" w:hAnsi="Calibri" w:eastAsia="Microsoft YaHei"/>
                 <w:sz w:val="19"/>
               </w:rPr>
-              <w:t>低到中；pip/Docker</w:t>
+              <w:t>低中</w:t>
             </w:r>
           </w:p>
         </w:tc>
         <w:tc>
           <w:tcPr>
-            <w:tcW w:type="dxa" w:w="2600"/>
+            <w:tcW w:type="dxa" w:w="3070"/>
             <w:tcMar>
               <w:top w:w="80" w:type="dxa"/>
               <w:start w:w="120" w:type="dxa"/>
@@ -823,13 +1602,13 @@
                 <w:rFonts w:ascii="Calibri" w:hAnsi="Calibri" w:eastAsia="Microsoft YaHei"/>
                 <w:sz w:val="19"/>
               </w:rPr>
-              <w:t>向量化扫描、事件消融</w:t>
+              <w:t>参数扫描、事件消融</w:t>
             </w:r>
           </w:p>
         </w:tc>
         <w:tc>
           <w:tcPr>
-            <w:tcW w:type="dxa" w:w="1460"/>
+            <w:tcW w:type="dxa" w:w="1880"/>
             <w:tcMar>
               <w:top w:w="80" w:type="dxa"/>
               <w:start w:w="120" w:type="dxa"/>
@@ -856,6 +1635,15 @@
       </w:pPr>
     </w:p>
     <w:p>
+      <w:r>
+        <w:rPr>
+          <w:rFonts w:ascii="Calibri" w:hAnsi="Calibri" w:eastAsia="Microsoft YaHei"/>
+          <w:i w:val="0"/>
+        </w:rPr>
+        <w:t>候选信息基于 2026-08-20 已记录的 GitHub、README、LICENSE 和 PyPI 调研。本轮 GitHub REST 公共 API 被共享出口限流，未把失败请求当作新证据。</w:t>
+      </w:r>
+    </w:p>
+    <w:p>
       <w:pPr>
         <w:pStyle w:val="Heading1"/>
       </w:pPr>
@@ -865,46 +1653,112 @@
     </w:p>
     <w:p>
       <w:pPr>
-        <w:pStyle w:val="ListBullet"/>
+        <w:pStyle w:val="ListNumber"/>
+        <w:numPr>
+          <w:ilvl w:val="0"/>
+          <w:numId w:val="10"/>
+        </w:numPr>
       </w:pPr>
       <w:r>
         <w:rPr>
           <w:rFonts w:ascii="Calibri" w:hAnsi="Calibri" w:eastAsia="Microsoft YaHei"/>
         </w:rPr>
-        <w:t>输入五类文件：事件版本 JSON、证据 JSON、实体映射 CSV、日线行情 CSV、因子基线权重 CSV。</w:t>
+        <w:t>从新闻 API 逐版本导出事件、证据、URL 和 ticker。</w:t>
       </w:r>
     </w:p>
     <w:p>
       <w:pPr>
-        <w:pStyle w:val="ListBullet"/>
+        <w:pStyle w:val="ListNumber"/>
+        <w:numPr>
+          <w:ilvl w:val="0"/>
+          <w:numId w:val="10"/>
+        </w:numPr>
       </w:pPr>
       <w:r>
         <w:rPr>
           <w:rFonts w:ascii="Calibri" w:hAnsi="Calibri" w:eastAsia="Microsoft YaHei"/>
         </w:rPr>
-        <w:t>处理六件事：as-of 版本选择、实体映射、事件信号、1/3/5/20 日事件研究、有限幅度 overlay、T+1 Paper OMS。</w:t>
+        <w:t>从 V3 权重、行业映射和 adj_close 生成 as-of 因子基线。</w:t>
       </w:r>
     </w:p>
     <w:p>
       <w:pPr>
-        <w:pStyle w:val="ListBullet"/>
+        <w:pStyle w:val="ListNumber"/>
+        <w:numPr>
+          <w:ilvl w:val="0"/>
+          <w:numId w:val="10"/>
+        </w:numPr>
       </w:pPr>
       <w:r>
         <w:rPr>
           <w:rFonts w:ascii="Calibri" w:hAnsi="Calibri" w:eastAsia="Microsoft YaHei"/>
         </w:rPr>
-        <w:t>输出报告、信号、订单、成交、事件研究 CSV、SQLite 账本、自动验证结果和只读 HTTP API。</w:t>
+        <w:t>输出因子基线、事件基线、因子 + 事件三路权重。</w:t>
       </w:r>
     </w:p>
     <w:p>
       <w:pPr>
-        <w:pStyle w:val="ListBullet"/>
+        <w:pStyle w:val="ListNumber"/>
+        <w:numPr>
+          <w:ilvl w:val="0"/>
+          <w:numId w:val="10"/>
+        </w:numPr>
       </w:pPr>
       <w:r>
         <w:rPr>
           <w:rFonts w:ascii="Calibri" w:hAnsi="Calibri" w:eastAsia="Microsoft YaHei"/>
         </w:rPr>
-        <w:t>不做新闻前端、不接券商、不读取真实凭据、不训练复杂 ML、不把样例数据包装成实盘结论。</w:t>
+        <w:t>预 V4 delta 保持净敞口不变，并限制单票和总换手。</w:t>
+      </w:r>
+    </w:p>
+    <w:p>
+      <w:pPr>
+        <w:pStyle w:val="ListNumber"/>
+        <w:numPr>
+          <w:ilvl w:val="0"/>
+          <w:numId w:val="10"/>
+        </w:numPr>
+      </w:pPr>
+      <w:r>
+        <w:rPr>
+          <w:rFonts w:ascii="Calibri" w:hAnsi="Calibri" w:eastAsia="Microsoft YaHei"/>
+        </w:rPr>
+        <w:t>生成 V4 cache，运行 V4 production loader 和三路 T+1 回测。</w:t>
+      </w:r>
+    </w:p>
+    <w:p>
+      <w:pPr>
+        <w:pStyle w:val="ListNumber"/>
+        <w:numPr>
+          <w:ilvl w:val="0"/>
+          <w:numId w:val="10"/>
+        </w:numPr>
+      </w:pPr>
+      <w:r>
+        <w:rPr>
+          <w:rFonts w:ascii="Calibri" w:hAnsi="Calibri" w:eastAsia="Microsoft YaHei"/>
+        </w:rPr>
+        <w:t>生成 T+1 Paper 订单，逐笔携带 signal/event/evidence lineage。</w:t>
+      </w:r>
+    </w:p>
+    <w:p>
+      <w:pPr>
+        <w:pStyle w:val="ListNumber"/>
+        <w:numPr>
+          <w:ilvl w:val="0"/>
+          <w:numId w:val="10"/>
+        </w:numPr>
+      </w:pPr>
+      <w:r>
+        <w:rPr>
+          <w:rFonts w:ascii="Calibri" w:hAnsi="Calibri" w:eastAsia="Microsoft YaHei"/>
+        </w:rPr>
+        <w:t>提供只读结果 API；没有任何券商或真实订单写入口。</w:t>
+      </w:r>
+    </w:p>
+    <w:p>
+      <w:r>
+        <w:br w:type="page"/>
       </w:r>
     </w:p>
     <w:p>
@@ -912,7 +1766,7 @@
         <w:pStyle w:val="Heading1"/>
       </w:pPr>
       <w:r>
-        <w:t>选型决策依据</w:t>
+        <w:t>验证状态</w:t>
       </w:r>
     </w:p>
     <w:tbl>
@@ -924,16 +1778,19 @@
         <w:tblInd w:w="120" w:type="dxa"/>
       </w:tblPr>
       <w:tblGrid>
-        <w:gridCol w:w="1900"/>
-        <w:gridCol w:w="2450"/>
-        <w:gridCol w:w="3000"/>
-        <w:gridCol w:w="2010"/>
+        <w:gridCol w:w="1600"/>
+        <w:gridCol w:w="2150"/>
+        <w:gridCol w:w="5610"/>
       </w:tblGrid>
       <w:tr>
+        <w:trPr>
+          <w:cantSplit/>
+          <w:tblHeader w:val="true"/>
+        </w:trPr>
         <w:tc>
           <w:tcPr>
-            <w:tcW w:type="dxa" w:w="1900"/>
-            <w:shd w:fill="E8EEF5"/>
+            <w:tcW w:type="dxa" w:w="1600"/>
+            <w:shd w:fill="F2F4F7"/>
             <w:tcMar>
               <w:top w:w="80" w:type="dxa"/>
               <w:start w:w="120" w:type="dxa"/>
@@ -953,14 +1810,14 @@
                 <w:color w:val="1F4D78"/>
                 <w:sz w:val="20"/>
               </w:rPr>
-              <w:t>选项</w:t>
+              <w:t>分类</w:t>
             </w:r>
           </w:p>
         </w:tc>
         <w:tc>
           <w:tcPr>
-            <w:tcW w:type="dxa" w:w="2450"/>
-            <w:shd w:fill="E8EEF5"/>
+            <w:tcW w:type="dxa" w:w="2150"/>
+            <w:shd w:fill="F2F4F7"/>
             <w:tcMar>
               <w:top w:w="80" w:type="dxa"/>
               <w:start w:w="120" w:type="dxa"/>
@@ -980,14 +1837,14 @@
                 <w:color w:val="1F4D78"/>
                 <w:sz w:val="20"/>
               </w:rPr>
-              <w:t>优点</w:t>
+              <w:t>结论</w:t>
             </w:r>
           </w:p>
         </w:tc>
         <w:tc>
           <w:tcPr>
-            <w:tcW w:type="dxa" w:w="3000"/>
-            <w:shd w:fill="E8EEF5"/>
+            <w:tcW w:type="dxa" w:w="5610"/>
+            <w:shd w:fill="F2F4F7"/>
             <w:tcMar>
               <w:top w:w="80" w:type="dxa"/>
               <w:start w:w="120" w:type="dxa"/>
@@ -1007,45 +1864,18 @@
                 <w:color w:val="1F4D78"/>
                 <w:sz w:val="20"/>
               </w:rPr>
-              <w:t>主要风险</w:t>
+              <w:t>证据/限制</w:t>
             </w:r>
           </w:p>
         </w:tc>
+      </w:tr>
+      <w:tr>
+        <w:trPr>
+          <w:cantSplit/>
+        </w:trPr>
         <w:tc>
           <w:tcPr>
-            <w:tcW w:type="dxa" w:w="2010"/>
-            <w:shd w:fill="E8EEF5"/>
-            <w:tcMar>
-              <w:top w:w="80" w:type="dxa"/>
-              <w:start w:w="120" w:type="dxa"/>
-              <w:bottom w:w="80" w:type="dxa"/>
-              <w:end w:w="120" w:type="dxa"/>
-            </w:tcMar>
-            <w:vAlign w:val="center"/>
-          </w:tcPr>
-          <w:p>
-            <w:pPr>
-              <w:jc w:val="left"/>
-            </w:pPr>
-            <w:r>
-              <w:rPr>
-                <w:rFonts w:ascii="Calibri" w:hAnsi="Calibri" w:eastAsia="Microsoft YaHei"/>
-                <w:b/>
-                <w:color w:val="1F4D78"/>
-                <w:sz w:val="20"/>
-              </w:rPr>
-              <w:t>最终判断</w:t>
-            </w:r>
-          </w:p>
-        </w:tc>
-        <w:trPr>
-          <w:tblHeader/>
-        </w:trPr>
-      </w:tr>
-      <w:tr>
-        <w:tc>
-          <w:tcPr>
-            <w:tcW w:type="dxa" w:w="1900"/>
+            <w:tcW w:type="dxa" w:w="1600"/>
             <w:tcMar>
               <w:top w:w="80" w:type="dxa"/>
               <w:start w:w="120" w:type="dxa"/>
@@ -1060,13 +1890,13 @@
                 <w:rFonts w:ascii="Calibri" w:hAnsi="Calibri" w:eastAsia="Microsoft YaHei"/>
                 <w:sz w:val="19"/>
               </w:rPr>
-              <w:t>直接使用</w:t>
+              <w:t>已验证事实</w:t>
             </w:r>
           </w:p>
         </w:tc>
         <w:tc>
           <w:tcPr>
-            <w:tcW w:type="dxa" w:w="2450"/>
+            <w:tcW w:type="dxa" w:w="2150"/>
             <w:tcMar>
               <w:top w:w="80" w:type="dxa"/>
               <w:start w:w="120" w:type="dxa"/>
@@ -1081,13 +1911,13 @@
                 <w:rFonts w:ascii="Calibri" w:hAnsi="Calibri" w:eastAsia="Microsoft YaHei"/>
                 <w:sz w:val="19"/>
               </w:rPr>
-              <w:t>上线快、通用能力完整</w:t>
+              <w:t>集成接口可运行</w:t>
             </w:r>
           </w:p>
         </w:tc>
         <w:tc>
           <w:tcPr>
-            <w:tcW w:type="dxa" w:w="3000"/>
+            <w:tcW w:type="dxa" w:w="5610"/>
             <w:tcMar>
               <w:top w:w="80" w:type="dxa"/>
               <w:start w:w="120" w:type="dxa"/>
@@ -1102,13 +1932,18 @@
                 <w:rFonts w:ascii="Calibri" w:hAnsi="Calibri" w:eastAsia="Microsoft YaHei"/>
                 <w:sz w:val="19"/>
               </w:rPr>
-              <w:t>无法满足证据/版本/归因契约；引入过多边界</w:t>
+              <w:t>新闻 GET、2 个版本、11/11 门禁、V4 prod loader、三路 backtest、Paper 闭合</w:t>
             </w:r>
           </w:p>
         </w:tc>
+      </w:tr>
+      <w:tr>
+        <w:trPr>
+          <w:cantSplit/>
+        </w:trPr>
         <w:tc>
           <w:tcPr>
-            <w:tcW w:type="dxa" w:w="2010"/>
+            <w:tcW w:type="dxa" w:w="1600"/>
             <w:tcMar>
               <w:top w:w="80" w:type="dxa"/>
               <w:start w:w="120" w:type="dxa"/>
@@ -1123,15 +1958,13 @@
                 <w:rFonts w:ascii="Calibri" w:hAnsi="Calibri" w:eastAsia="Microsoft YaHei"/>
                 <w:sz w:val="19"/>
               </w:rPr>
-              <w:t>不选</w:t>
+              <w:t>推断</w:t>
             </w:r>
           </w:p>
         </w:tc>
-      </w:tr>
-      <w:tr>
         <w:tc>
           <w:tcPr>
-            <w:tcW w:type="dxa" w:w="1900"/>
+            <w:tcW w:type="dxa" w:w="2150"/>
             <w:tcMar>
               <w:top w:w="80" w:type="dxa"/>
               <w:start w:w="120" w:type="dxa"/>
@@ -1146,13 +1979,13 @@
                 <w:rFonts w:ascii="Calibri" w:hAnsi="Calibri" w:eastAsia="Microsoft YaHei"/>
                 <w:sz w:val="19"/>
               </w:rPr>
-              <w:t>基于现有项目改</w:t>
+              <w:t>同契约真实数据可接入</w:t>
             </w:r>
           </w:p>
         </w:tc>
         <w:tc>
           <w:tcPr>
-            <w:tcW w:type="dxa" w:w="2450"/>
+            <w:tcW w:type="dxa" w:w="5610"/>
             <w:tcMar>
               <w:top w:w="80" w:type="dxa"/>
               <w:start w:w="120" w:type="dxa"/>
@@ -1167,13 +2000,18 @@
                 <w:rFonts w:ascii="Calibri" w:hAnsi="Calibri" w:eastAsia="Microsoft YaHei"/>
                 <w:sz w:val="19"/>
               </w:rPr>
-              <w:t>可复用既有因子平台</w:t>
+              <w:t>真实 V3 大文件尚未发现，仍需用户本地副本</w:t>
             </w:r>
           </w:p>
         </w:tc>
+      </w:tr>
+      <w:tr>
+        <w:trPr>
+          <w:cantSplit/>
+        </w:trPr>
         <w:tc>
           <w:tcPr>
-            <w:tcW w:type="dxa" w:w="3000"/>
+            <w:tcW w:type="dxa" w:w="1600"/>
             <w:tcMar>
               <w:top w:w="80" w:type="dxa"/>
               <w:start w:w="120" w:type="dxa"/>
@@ -1188,13 +2026,13 @@
                 <w:rFonts w:ascii="Calibri" w:hAnsi="Calibri" w:eastAsia="Microsoft YaHei"/>
                 <w:sz w:val="19"/>
               </w:rPr>
-              <w:t>当前工作区为空；跨项目耦合和发布边界不清</w:t>
+              <w:t>未知</w:t>
             </w:r>
           </w:p>
         </w:tc>
         <w:tc>
           <w:tcPr>
-            <w:tcW w:type="dxa" w:w="2010"/>
+            <w:tcW w:type="dxa" w:w="2150"/>
             <w:tcMar>
               <w:top w:w="80" w:type="dxa"/>
               <w:start w:w="120" w:type="dxa"/>
@@ -1209,15 +2047,13 @@
                 <w:rFonts w:ascii="Calibri" w:hAnsi="Calibri" w:eastAsia="Microsoft YaHei"/>
                 <w:sz w:val="19"/>
               </w:rPr>
-              <w:t>不作为本仓库方案</w:t>
+              <w:t>经济增量和实盘质量</w:t>
             </w:r>
           </w:p>
         </w:tc>
-      </w:tr>
-      <w:tr>
         <w:tc>
           <w:tcPr>
-            <w:tcW w:type="dxa" w:w="1900"/>
+            <w:tcW w:type="dxa" w:w="5610"/>
             <w:tcMar>
               <w:top w:w="80" w:type="dxa"/>
               <w:start w:w="120" w:type="dxa"/>
@@ -1232,13 +2068,18 @@
                 <w:rFonts w:ascii="Calibri" w:hAnsi="Calibri" w:eastAsia="Microsoft YaHei"/>
                 <w:sz w:val="19"/>
               </w:rPr>
-              <w:t>自己开发薄集成</w:t>
+              <w:t>真实事件、OOS、容量、borrow、成交尚未验证</w:t>
             </w:r>
           </w:p>
         </w:tc>
+      </w:tr>
+      <w:tr>
+        <w:trPr>
+          <w:cantSplit/>
+        </w:trPr>
         <w:tc>
           <w:tcPr>
-            <w:tcW w:type="dxa" w:w="2450"/>
+            <w:tcW w:type="dxa" w:w="1600"/>
             <w:tcMar>
               <w:top w:w="80" w:type="dxa"/>
               <w:start w:w="120" w:type="dxa"/>
@@ -1253,13 +2094,13 @@
                 <w:rFonts w:ascii="Calibri" w:hAnsi="Calibri" w:eastAsia="Microsoft YaHei"/>
                 <w:sz w:val="19"/>
               </w:rPr>
-              <w:t>边界清晰、可审计、部署简单</w:t>
+              <w:t>决策</w:t>
             </w:r>
           </w:p>
         </w:tc>
         <w:tc>
           <w:tcPr>
-            <w:tcW w:type="dxa" w:w="3000"/>
+            <w:tcW w:type="dxa" w:w="2150"/>
             <w:tcMar>
               <w:top w:w="80" w:type="dxa"/>
               <w:start w:w="120" w:type="dxa"/>
@@ -1274,13 +2115,13 @@
                 <w:rFonts w:ascii="Calibri" w:hAnsi="Calibri" w:eastAsia="Microsoft YaHei"/>
                 <w:sz w:val="19"/>
               </w:rPr>
-              <w:t>需自行维护契约和 OMS</w:t>
+              <w:t>研究/Paper 可用</w:t>
             </w:r>
           </w:p>
         </w:tc>
         <w:tc>
           <w:tcPr>
-            <w:tcW w:type="dxa" w:w="2010"/>
+            <w:tcW w:type="dxa" w:w="5610"/>
             <w:tcMar>
               <w:top w:w="80" w:type="dxa"/>
               <w:start w:w="120" w:type="dxa"/>
@@ -1295,7 +2136,7 @@
                 <w:rFonts w:ascii="Calibri" w:hAnsi="Calibri" w:eastAsia="Microsoft YaHei"/>
                 <w:sz w:val="19"/>
               </w:rPr>
-              <w:t>推荐</w:t>
+              <w:t>当前 INCONCLUSIVE；Live BLOCKED</w:t>
             </w:r>
           </w:p>
         </w:tc>
@@ -1311,7 +2152,7 @@
         <w:pStyle w:val="Heading1"/>
       </w:pPr>
       <w:r>
-        <w:t>证据与限制</w:t>
+        <w:t>最终选择</w:t>
       </w:r>
     </w:p>
     <w:p>
@@ -1320,62 +2161,7 @@
           <w:rFonts w:ascii="Calibri" w:hAnsi="Calibri" w:eastAsia="Microsoft YaHei"/>
           <w:i w:val="0"/>
         </w:rPr>
-        <w:t>调研结论基于 2026-08-20 读取的 GitHub 公共仓库元数据、项目 README/LICENSE 和 PyPI 元数据。维护活跃不等于适合本项目；许可证、数据源、API 稳定性和商业化限制必须在正式发布前再次复核。</w:t>
-      </w:r>
-    </w:p>
-    <w:p>
-      <w:pPr>
-        <w:pStyle w:val="ListBullet"/>
-      </w:pPr>
-      <w:r>
-        <w:rPr>
-          <w:rFonts w:ascii="Calibri" w:hAnsi="Calibri" w:eastAsia="Microsoft YaHei"/>
-        </w:rPr>
-        <w:t>https://github.com/microsoft/qlib</w:t>
-      </w:r>
-    </w:p>
-    <w:p>
-      <w:pPr>
-        <w:pStyle w:val="ListBullet"/>
-      </w:pPr>
-      <w:r>
-        <w:rPr>
-          <w:rFonts w:ascii="Calibri" w:hAnsi="Calibri" w:eastAsia="Microsoft YaHei"/>
-        </w:rPr>
-        <w:t>https://github.com/stefan-jansen/zipline-reloaded</w:t>
-      </w:r>
-    </w:p>
-    <w:p>
-      <w:pPr>
-        <w:pStyle w:val="ListBullet"/>
-      </w:pPr>
-      <w:r>
-        <w:rPr>
-          <w:rFonts w:ascii="Calibri" w:hAnsi="Calibri" w:eastAsia="Microsoft YaHei"/>
-        </w:rPr>
-        <w:t>https://github.com/nautechsystems/nautilus_trader</w:t>
-      </w:r>
-    </w:p>
-    <w:p>
-      <w:pPr>
-        <w:pStyle w:val="ListBullet"/>
-      </w:pPr>
-      <w:r>
-        <w:rPr>
-          <w:rFonts w:ascii="Calibri" w:hAnsi="Calibri" w:eastAsia="Microsoft YaHei"/>
-        </w:rPr>
-        <w:t>https://github.com/QuantConnect/Lean</w:t>
-      </w:r>
-    </w:p>
-    <w:p>
-      <w:pPr>
-        <w:pStyle w:val="ListBullet"/>
-      </w:pPr>
-      <w:r>
-        <w:rPr>
-          <w:rFonts w:ascii="Calibri" w:hAnsi="Calibri" w:eastAsia="Microsoft YaHei"/>
-        </w:rPr>
-        <w:t>https://github.com/polakowo/vectorbt</w:t>
+        <w:t>选择“基于现有项目改造并新增薄集成层”。这比直接使用通用引擎部署更简单，也比完全自研更尊重现有资产和责任边界。</w:t>
       </w:r>
     </w:p>
     <w:sectPr>
@@ -1403,8 +2189,17 @@
         <w:color w:val="646A74"/>
         <w:sz w:val="18"/>
       </w:rPr>
-      <w:t>v0.1.0 MVP | Internal working document</w:t>
+      <w:t xml:space="preserve">v0.2.0 | Internal research document | Page </w:t>
     </w:r>
+    <w:fldSimple w:instr="PAGE">
+      <w:r>
+        <w:rPr>
+          <w:color w:val="646A74"/>
+          <w:sz w:val="18"/>
+        </w:rPr>
+        <w:t>1</w:t>
+      </w:r>
+    </w:fldSimple>
   </w:p>
 </w:ftr>
 </file>
@@ -1627,6 +2422,12 @@
   </w:num>
   <w:num w:numId="9">
     <w:abstractNumId w:val="0"/>
+  </w:num>
+  <w:num w:numId="10">
+    <w:abstractNumId w:val="7"/>
+    <w:lvlOverride w:ilvl="0">
+      <w:startOverride w:val="1"/>
+    </w:lvlOverride>
   </w:num>
 </w:numbering>
 </file>

</xml_diff>

<commit_message>
[codex] add chronological independent validation
</commit_message>
<xml_diff>
--- a/deliverables/01_开源选型与MVP建议.docx
+++ b/deliverables/01_开源选型与MVP建议.docx
@@ -70,7 +70,7 @@
           <w:color w:val="23262B"/>
           <w:sz w:val="21"/>
         </w:rPr>
-        <w:t>v0.2.0 Integration MVP</w:t>
+        <w:t>v0.3.0 Independent Validation</w:t>
       </w:r>
     </w:p>
     <w:p>
@@ -92,7 +92,7 @@
           <w:color w:val="23262B"/>
           <w:sz w:val="21"/>
         </w:rPr>
-        <w:t>2026-08-20</w:t>
+        <w:t>2026-08-21</w:t>
       </w:r>
     </w:p>
     <w:p>
@@ -114,7 +114,7 @@
           <w:color w:val="23262B"/>
           <w:sz w:val="21"/>
         </w:rPr>
-        <w:t>选型已冻结；研究/Paper 可用；Live 阻断</w:t>
+        <w:t>选型保持不变；独立验证已实现；Live 阻断</w:t>
       </w:r>
     </w:p>
     <w:p>
@@ -1911,7 +1911,7 @@
                 <w:rFonts w:ascii="Calibri" w:hAnsi="Calibri" w:eastAsia="Microsoft YaHei"/>
                 <w:sz w:val="19"/>
               </w:rPr>
-              <w:t>集成接口可运行</w:t>
+              <w:t>集成和验证接口可运行</w:t>
             </w:r>
           </w:p>
         </w:tc>
@@ -1932,7 +1932,7 @@
                 <w:rFonts w:ascii="Calibri" w:hAnsi="Calibri" w:eastAsia="Microsoft YaHei"/>
                 <w:sz w:val="19"/>
               </w:rPr>
-              <w:t>新闻 GET、2 个版本、11/11 门禁、V4 prod loader、三路 backtest、Paper 闭合</w:t>
+              <w:t>21/21 测试；独立 IS/OOS、滚动折叠、placebo、延迟和成本翻倍门禁已实现</w:t>
             </w:r>
           </w:p>
         </w:tc>
@@ -2068,7 +2068,7 @@
                 <w:rFonts w:ascii="Calibri" w:hAnsi="Calibri" w:eastAsia="Microsoft YaHei"/>
                 <w:sz w:val="19"/>
               </w:rPr>
-              <w:t>真实事件、OOS、容量、borrow、成交尚未验证</w:t>
+              <w:t>当前仅 2 个 synthetic 事件；真实 OOS、容量、borrow、成交尚未验证</w:t>
             </w:r>
           </w:p>
         </w:tc>
@@ -2189,7 +2189,7 @@
         <w:color w:val="646A74"/>
         <w:sz w:val="18"/>
       </w:rPr>
-      <w:t xml:space="preserve">v0.2.0 | Internal research document | Page </w:t>
+      <w:t xml:space="preserve">v0.3.0 | Internal research document | Page </w:t>
     </w:r>
     <w:fldSimple w:instr="PAGE">
       <w:r>

</xml_diff>

<commit_message>
add integrated validation v0.4
</commit_message>
<xml_diff>
--- a/deliverables/01_开源选型与MVP建议.docx
+++ b/deliverables/01_开源选型与MVP建议.docx
@@ -70,7 +70,7 @@
           <w:color w:val="23262B"/>
           <w:sz w:val="21"/>
         </w:rPr>
-        <w:t>v0.3.0 Independent Validation</w:t>
+        <w:t>v0.4.0 Integrated Validation</w:t>
       </w:r>
     </w:p>
     <w:p>
@@ -114,7 +114,7 @@
           <w:color w:val="23262B"/>
           <w:sz w:val="21"/>
         </w:rPr>
-        <w:t>选型保持不变；独立验证已实现；Live 阻断</w:t>
+        <w:t>选型保持不变；集成独立验证已实现；Live 阻断</w:t>
       </w:r>
     </w:p>
     <w:p>
@@ -1932,7 +1932,7 @@
                 <w:rFonts w:ascii="Calibri" w:hAnsi="Calibri" w:eastAsia="Microsoft YaHei"/>
                 <w:sz w:val="19"/>
               </w:rPr>
-              <w:t>21/21 测试；独立 IS/OOS、滚动折叠、placebo、延迟和成本翻倍门禁已实现</w:t>
+              <w:t>22/22 测试；integrate 已接入事件研究、独立 IS/OOS、滚动、placebo、延迟和成本翻倍门禁</w:t>
             </w:r>
           </w:p>
         </w:tc>
@@ -2152,6 +2152,69 @@
         <w:pStyle w:val="Heading1"/>
       </w:pPr>
       <w:r>
+        <w:t>v0.4.0 集成验证更新</w:t>
+      </w:r>
+    </w:p>
+    <w:p>
+      <w:pPr>
+        <w:pStyle w:val="ListBullet"/>
+      </w:pPr>
+      <w:r>
+        <w:rPr>
+          <w:rFonts w:ascii="Calibri" w:hAnsi="Calibri" w:eastAsia="Microsoft YaHei"/>
+        </w:rPr>
+        <w:t>独立验证器已从核心 run 路径接入真实三系统 integrate 路径。</w:t>
+      </w:r>
+    </w:p>
+    <w:p>
+      <w:pPr>
+        <w:pStyle w:val="ListBullet"/>
+      </w:pPr>
+      <w:r>
+        <w:rPr>
+          <w:rFonts w:ascii="Calibri" w:hAnsi="Calibri" w:eastAsia="Microsoft YaHei"/>
+        </w:rPr>
+        <w:t>集成输出新增 event_study.csv、五个数值稳健性场景、independent_validation.json 和标准 audit.json。</w:t>
+      </w:r>
+    </w:p>
+    <w:p>
+      <w:pPr>
+        <w:pStyle w:val="ListBullet"/>
+      </w:pPr>
+      <w:r>
+        <w:rPr>
+          <w:rFonts w:ascii="Calibri" w:hAnsi="Calibri" w:eastAsia="Microsoft YaHei"/>
+        </w:rPr>
+        <w:t>Synthetic manifest 会覆盖任何 real 声明并强制分类为 synthetic，不能 PROMOTE。</w:t>
+      </w:r>
+    </w:p>
+    <w:p>
+      <w:pPr>
+        <w:pStyle w:val="ListBullet"/>
+      </w:pPr>
+      <w:r>
+        <w:rPr>
+          <w:rFonts w:ascii="Calibri" w:hAnsi="Calibri" w:eastAsia="Microsoft YaHei"/>
+        </w:rPr>
+        <w:t>验证运行 INT-3294801BE2C27699：13 个集成硬门禁全部通过，V4 loader 与三路回测均 PASS，标准 verify 通过。</w:t>
+      </w:r>
+    </w:p>
+    <w:p>
+      <w:pPr>
+        <w:pStyle w:val="ListBullet"/>
+      </w:pPr>
+      <w:r>
+        <w:rPr>
+          <w:rFonts w:ascii="Calibri" w:hAnsi="Calibri" w:eastAsia="Microsoft YaHei"/>
+        </w:rPr>
+        <w:t>当前仅 1 个 synthetic 可见事件，5 日主窗口样本不足，决策仍为 INCONCLUSIVE；Live 继续 BLOCKED。</w:t>
+      </w:r>
+    </w:p>
+    <w:p>
+      <w:pPr>
+        <w:pStyle w:val="Heading1"/>
+      </w:pPr>
+      <w:r>
         <w:t>最终选择</w:t>
       </w:r>
     </w:p>
@@ -2189,7 +2252,7 @@
         <w:color w:val="646A74"/>
         <w:sz w:val="18"/>
       </w:rPr>
-      <w:t xml:space="preserve">v0.3.0 | Internal research document | Page </w:t>
+      <w:t xml:space="preserve">v0.4.0 | Internal research document | Page </w:t>
     </w:r>
     <w:fldSimple w:instr="PAGE">
       <w:r>

</xml_diff>